<commit_message>
Reorganized again and created animation transitions docs
</commit_message>
<xml_diff>
--- a/flutter more documents/f25_flutter_animations.docx
+++ b/flutter more documents/f25_flutter_animations.docx
@@ -898,14 +898,25 @@
         <w:t>contolller</w:t>
       </w:r>
       <w:proofErr w:type="spellEnd"/>
-      <w:r>
-        <w:rPr>
-          <w:b/>
-          <w:bCs/>
-          <w:sz w:val="36"/>
-          <w:szCs w:val="36"/>
-        </w:rPr>
-        <w:t xml:space="preserve"> .. </w:t>
+      <w:proofErr w:type="gramStart"/>
+      <w:r>
+        <w:rPr>
+          <w:b/>
+          <w:bCs/>
+          <w:sz w:val="36"/>
+          <w:szCs w:val="36"/>
+        </w:rPr>
+        <w:t xml:space="preserve"> ..</w:t>
+      </w:r>
+      <w:proofErr w:type="gramEnd"/>
+      <w:r>
+        <w:rPr>
+          <w:b/>
+          <w:bCs/>
+          <w:sz w:val="36"/>
+          <w:szCs w:val="36"/>
+        </w:rPr>
+        <w:t xml:space="preserve"> </w:t>
       </w:r>
       <w:r>
         <w:rPr>
@@ -969,16 +980,34 @@
           <w:sz w:val="36"/>
           <w:szCs w:val="36"/>
         </w:rPr>
-        <w:t xml:space="preserve"># </w:t>
-      </w:r>
-      <w:r>
-        <w:rPr>
-          <w:b/>
-          <w:bCs/>
-          <w:sz w:val="36"/>
-          <w:szCs w:val="36"/>
-        </w:rPr>
-        <w:t xml:space="preserve">..duration = </w:t>
+        <w:t>#</w:t>
+      </w:r>
+      <w:proofErr w:type="gramStart"/>
+      <w:r>
+        <w:rPr>
+          <w:sz w:val="36"/>
+          <w:szCs w:val="36"/>
+        </w:rPr>
+        <w:t xml:space="preserve"> </w:t>
+      </w:r>
+      <w:r>
+        <w:rPr>
+          <w:b/>
+          <w:bCs/>
+          <w:sz w:val="36"/>
+          <w:szCs w:val="36"/>
+        </w:rPr>
+        <w:t>..</w:t>
+      </w:r>
+      <w:proofErr w:type="gramEnd"/>
+      <w:r>
+        <w:rPr>
+          <w:b/>
+          <w:bCs/>
+          <w:sz w:val="36"/>
+          <w:szCs w:val="36"/>
+        </w:rPr>
+        <w:t xml:space="preserve">duration = </w:t>
       </w:r>
       <w:proofErr w:type="spellStart"/>
       <w:r>
@@ -1112,6 +1141,7 @@
         <w:t xml:space="preserve">. </w:t>
       </w:r>
       <w:proofErr w:type="spellStart"/>
+      <w:proofErr w:type="gramStart"/>
       <w:r>
         <w:rPr>
           <w:b/>
@@ -1122,6 +1152,7 @@
         <w:t>composition.duration</w:t>
       </w:r>
       <w:proofErr w:type="spellEnd"/>
+      <w:proofErr w:type="gramEnd"/>
       <w:r>
         <w:rPr>
           <w:b/>
@@ -1196,16 +1227,34 @@
           <w:sz w:val="36"/>
           <w:szCs w:val="36"/>
         </w:rPr>
-        <w:t xml:space="preserve"># </w:t>
-      </w:r>
-      <w:r>
-        <w:rPr>
-          <w:b/>
-          <w:bCs/>
-          <w:sz w:val="36"/>
-          <w:szCs w:val="36"/>
-        </w:rPr>
-        <w:t>..repeat();</w:t>
+        <w:t>#</w:t>
+      </w:r>
+      <w:proofErr w:type="gramStart"/>
+      <w:r>
+        <w:rPr>
+          <w:sz w:val="36"/>
+          <w:szCs w:val="36"/>
+        </w:rPr>
+        <w:t xml:space="preserve"> </w:t>
+      </w:r>
+      <w:r>
+        <w:rPr>
+          <w:b/>
+          <w:bCs/>
+          <w:sz w:val="36"/>
+          <w:szCs w:val="36"/>
+        </w:rPr>
+        <w:t>..</w:t>
+      </w:r>
+      <w:proofErr w:type="gramEnd"/>
+      <w:r>
+        <w:rPr>
+          <w:b/>
+          <w:bCs/>
+          <w:sz w:val="36"/>
+          <w:szCs w:val="36"/>
+        </w:rPr>
+        <w:t>repeat();</w:t>
       </w:r>
       <w:r>
         <w:rPr>
@@ -16500,16 +16549,7 @@
           <w:sz w:val="36"/>
           <w:szCs w:val="36"/>
         </w:rPr>
-        <w:t>angle: value * 2 * π</w:t>
-      </w:r>
-      <w:r>
-        <w:rPr>
-          <w:b/>
-          <w:bCs/>
-          <w:sz w:val="36"/>
-          <w:szCs w:val="36"/>
-        </w:rPr>
-        <w:t xml:space="preserve"> (3.1416)</w:t>
+        <w:t>angle: value * 2 * π (3.1416)</w:t>
       </w:r>
       <w:r>
         <w:rPr>
@@ -16580,16 +16620,7 @@
           <w:sz w:val="36"/>
           <w:szCs w:val="36"/>
         </w:rPr>
-        <w:t>2</w:t>
-      </w:r>
-      <w:r>
-        <w:rPr>
-          <w:b/>
-          <w:bCs/>
-          <w:sz w:val="36"/>
-          <w:szCs w:val="36"/>
-        </w:rPr>
-        <w:t>π</w:t>
+        <w:t>2π</w:t>
       </w:r>
       <w:r>
         <w:rPr>
@@ -16711,37 +16742,8 @@
           <w:sz w:val="36"/>
           <w:szCs w:val="36"/>
         </w:rPr>
-        <w:t>2</w:t>
-      </w:r>
-      <w:r>
-        <w:rPr>
-          <w:b/>
-          <w:bCs/>
-          <w:sz w:val="36"/>
-          <w:szCs w:val="36"/>
-        </w:rPr>
-        <w:t>π</w:t>
-      </w:r>
-      <w:r>
-        <w:rPr>
-          <w:b/>
-          <w:bCs/>
-          <w:sz w:val="36"/>
-          <w:szCs w:val="36"/>
-        </w:rPr>
-        <w:t xml:space="preserve"> </w:t>
-      </w:r>
-      <w:proofErr w:type="spellStart"/>
-      <w:r>
-        <w:rPr>
-          <w:b/>
-          <w:bCs/>
-          <w:sz w:val="36"/>
-          <w:szCs w:val="36"/>
-        </w:rPr>
-        <w:t>rad</w:t>
-      </w:r>
-      <w:proofErr w:type="spellEnd"/>
+        <w:t>2π rad</w:t>
+      </w:r>
       <w:r>
         <w:rPr>
           <w:sz w:val="36"/>
@@ -17576,17 +17578,7 @@
           <w:sz w:val="36"/>
           <w:szCs w:val="36"/>
         </w:rPr>
-        <w:t xml:space="preserve">          </w:t>
-      </w:r>
-      <w:r>
-        <w:rPr>
-          <w:b/>
-          <w:bCs/>
-          <w:color w:val="D86DCB" w:themeColor="accent5" w:themeTint="99"/>
-          <w:sz w:val="36"/>
-          <w:szCs w:val="36"/>
-        </w:rPr>
-        <w:t>…</w:t>
+        <w:t xml:space="preserve">          …</w:t>
       </w:r>
     </w:p>
     <w:p>
@@ -17792,17 +17784,7 @@
           <w:sz w:val="36"/>
           <w:szCs w:val="36"/>
         </w:rPr>
-        <w:t>…</w:t>
-      </w:r>
-      <w:r>
-        <w:rPr>
-          <w:b/>
-          <w:bCs/>
-          <w:color w:val="D86DCB" w:themeColor="accent5" w:themeTint="99"/>
-          <w:sz w:val="36"/>
-          <w:szCs w:val="36"/>
-        </w:rPr>
-        <w:t xml:space="preserve">       </w:t>
+        <w:t xml:space="preserve">…       </w:t>
       </w:r>
     </w:p>
     <w:p>
@@ -18777,14 +18759,7 @@
           <w:sz w:val="36"/>
           <w:szCs w:val="36"/>
         </w:rPr>
-        <w:t>I</w:t>
-      </w:r>
-      <w:r>
-        <w:rPr>
-          <w:sz w:val="36"/>
-          <w:szCs w:val="36"/>
-        </w:rPr>
-        <w:t>nternal Insight (important for interviews)</w:t>
+        <w:t>Internal Insight (important for interviews)</w:t>
       </w:r>
     </w:p>
     <w:p>
@@ -19113,24 +19088,6 @@
         </w:rPr>
         <w:t>Keep UI declarative</w:t>
       </w:r>
-    </w:p>
-    <w:p>
-      <w:pPr>
-        <w:jc w:val="both"/>
-        <w:rPr>
-          <w:sz w:val="36"/>
-          <w:szCs w:val="36"/>
-        </w:rPr>
-      </w:pPr>
-    </w:p>
-    <w:p>
-      <w:pPr>
-        <w:jc w:val="both"/>
-        <w:rPr>
-          <w:sz w:val="36"/>
-          <w:szCs w:val="36"/>
-        </w:rPr>
-      </w:pPr>
     </w:p>
     <w:p>
       <w:pPr>
@@ -19285,7 +19242,7 @@
       <w:lvlText w:val=""/>
       <w:lvlJc w:val="left"/>
       <w:pPr>
-        <w:ind w:left="-720" w:hanging="360"/>
+        <w:ind w:left="-1080" w:hanging="360"/>
       </w:pPr>
       <w:rPr>
         <w:rFonts w:ascii="Symbol" w:hAnsi="Symbol" w:hint="default"/>
@@ -19297,7 +19254,7 @@
       <w:lvlText w:val="o"/>
       <w:lvlJc w:val="left"/>
       <w:pPr>
-        <w:ind w:left="0" w:hanging="360"/>
+        <w:ind w:left="-360" w:hanging="360"/>
       </w:pPr>
       <w:rPr>
         <w:rFonts w:ascii="Courier New" w:hAnsi="Courier New" w:cs="Courier New" w:hint="default"/>
@@ -19309,7 +19266,7 @@
       <w:lvlText w:val=""/>
       <w:lvlJc w:val="left"/>
       <w:pPr>
-        <w:ind w:left="720" w:hanging="360"/>
+        <w:ind w:left="360" w:hanging="360"/>
       </w:pPr>
       <w:rPr>
         <w:rFonts w:ascii="Wingdings" w:hAnsi="Wingdings" w:hint="default"/>
@@ -19321,7 +19278,7 @@
       <w:lvlText w:val=""/>
       <w:lvlJc w:val="left"/>
       <w:pPr>
-        <w:ind w:left="1440" w:hanging="360"/>
+        <w:ind w:left="1080" w:hanging="360"/>
       </w:pPr>
       <w:rPr>
         <w:rFonts w:ascii="Symbol" w:hAnsi="Symbol" w:hint="default"/>
@@ -19333,7 +19290,7 @@
       <w:lvlText w:val="o"/>
       <w:lvlJc w:val="left"/>
       <w:pPr>
-        <w:ind w:left="2160" w:hanging="360"/>
+        <w:ind w:left="1800" w:hanging="360"/>
       </w:pPr>
       <w:rPr>
         <w:rFonts w:ascii="Courier New" w:hAnsi="Courier New" w:cs="Courier New" w:hint="default"/>
@@ -19345,7 +19302,7 @@
       <w:lvlText w:val=""/>
       <w:lvlJc w:val="left"/>
       <w:pPr>
-        <w:ind w:left="2880" w:hanging="360"/>
+        <w:ind w:left="2520" w:hanging="360"/>
       </w:pPr>
       <w:rPr>
         <w:rFonts w:ascii="Wingdings" w:hAnsi="Wingdings" w:hint="default"/>
@@ -19357,7 +19314,7 @@
       <w:lvlText w:val=""/>
       <w:lvlJc w:val="left"/>
       <w:pPr>
-        <w:ind w:left="3600" w:hanging="360"/>
+        <w:ind w:left="3240" w:hanging="360"/>
       </w:pPr>
       <w:rPr>
         <w:rFonts w:ascii="Symbol" w:hAnsi="Symbol" w:hint="default"/>
@@ -19369,7 +19326,7 @@
       <w:lvlText w:val="o"/>
       <w:lvlJc w:val="left"/>
       <w:pPr>
-        <w:ind w:left="4320" w:hanging="360"/>
+        <w:ind w:left="3960" w:hanging="360"/>
       </w:pPr>
       <w:rPr>
         <w:rFonts w:ascii="Courier New" w:hAnsi="Courier New" w:cs="Courier New" w:hint="default"/>
@@ -19381,7 +19338,7 @@
       <w:lvlText w:val=""/>
       <w:lvlJc w:val="left"/>
       <w:pPr>
-        <w:ind w:left="5040" w:hanging="360"/>
+        <w:ind w:left="4680" w:hanging="360"/>
       </w:pPr>
       <w:rPr>
         <w:rFonts w:ascii="Wingdings" w:hAnsi="Wingdings" w:hint="default"/>
@@ -19990,6 +19947,119 @@
     </w:lvl>
   </w:abstractNum>
   <w:abstractNum w:abstractNumId="6" w15:restartNumberingAfterBreak="0">
+    <w:nsid w:val="196B45ED"/>
+    <w:multiLevelType w:val="hybridMultilevel"/>
+    <w:tmpl w:val="35A43DCC"/>
+    <w:lvl w:ilvl="0" w:tplc="04090001">
+      <w:start w:val="1"/>
+      <w:numFmt w:val="bullet"/>
+      <w:lvlText w:val=""/>
+      <w:lvlJc w:val="left"/>
+      <w:pPr>
+        <w:ind w:left="360" w:hanging="360"/>
+      </w:pPr>
+      <w:rPr>
+        <w:rFonts w:ascii="Symbol" w:hAnsi="Symbol" w:hint="default"/>
+      </w:rPr>
+    </w:lvl>
+    <w:lvl w:ilvl="1" w:tplc="04090003" w:tentative="1">
+      <w:start w:val="1"/>
+      <w:numFmt w:val="bullet"/>
+      <w:lvlText w:val="o"/>
+      <w:lvlJc w:val="left"/>
+      <w:pPr>
+        <w:ind w:left="1080" w:hanging="360"/>
+      </w:pPr>
+      <w:rPr>
+        <w:rFonts w:ascii="Courier New" w:hAnsi="Courier New" w:cs="Courier New" w:hint="default"/>
+      </w:rPr>
+    </w:lvl>
+    <w:lvl w:ilvl="2" w:tplc="04090005" w:tentative="1">
+      <w:start w:val="1"/>
+      <w:numFmt w:val="bullet"/>
+      <w:lvlText w:val=""/>
+      <w:lvlJc w:val="left"/>
+      <w:pPr>
+        <w:ind w:left="1800" w:hanging="360"/>
+      </w:pPr>
+      <w:rPr>
+        <w:rFonts w:ascii="Wingdings" w:hAnsi="Wingdings" w:hint="default"/>
+      </w:rPr>
+    </w:lvl>
+    <w:lvl w:ilvl="3" w:tplc="04090001" w:tentative="1">
+      <w:start w:val="1"/>
+      <w:numFmt w:val="bullet"/>
+      <w:lvlText w:val=""/>
+      <w:lvlJc w:val="left"/>
+      <w:pPr>
+        <w:ind w:left="2520" w:hanging="360"/>
+      </w:pPr>
+      <w:rPr>
+        <w:rFonts w:ascii="Symbol" w:hAnsi="Symbol" w:hint="default"/>
+      </w:rPr>
+    </w:lvl>
+    <w:lvl w:ilvl="4" w:tplc="04090003" w:tentative="1">
+      <w:start w:val="1"/>
+      <w:numFmt w:val="bullet"/>
+      <w:lvlText w:val="o"/>
+      <w:lvlJc w:val="left"/>
+      <w:pPr>
+        <w:ind w:left="3240" w:hanging="360"/>
+      </w:pPr>
+      <w:rPr>
+        <w:rFonts w:ascii="Courier New" w:hAnsi="Courier New" w:cs="Courier New" w:hint="default"/>
+      </w:rPr>
+    </w:lvl>
+    <w:lvl w:ilvl="5" w:tplc="04090005" w:tentative="1">
+      <w:start w:val="1"/>
+      <w:numFmt w:val="bullet"/>
+      <w:lvlText w:val=""/>
+      <w:lvlJc w:val="left"/>
+      <w:pPr>
+        <w:ind w:left="3960" w:hanging="360"/>
+      </w:pPr>
+      <w:rPr>
+        <w:rFonts w:ascii="Wingdings" w:hAnsi="Wingdings" w:hint="default"/>
+      </w:rPr>
+    </w:lvl>
+    <w:lvl w:ilvl="6" w:tplc="04090001" w:tentative="1">
+      <w:start w:val="1"/>
+      <w:numFmt w:val="bullet"/>
+      <w:lvlText w:val=""/>
+      <w:lvlJc w:val="left"/>
+      <w:pPr>
+        <w:ind w:left="4680" w:hanging="360"/>
+      </w:pPr>
+      <w:rPr>
+        <w:rFonts w:ascii="Symbol" w:hAnsi="Symbol" w:hint="default"/>
+      </w:rPr>
+    </w:lvl>
+    <w:lvl w:ilvl="7" w:tplc="04090003" w:tentative="1">
+      <w:start w:val="1"/>
+      <w:numFmt w:val="bullet"/>
+      <w:lvlText w:val="o"/>
+      <w:lvlJc w:val="left"/>
+      <w:pPr>
+        <w:ind w:left="5400" w:hanging="360"/>
+      </w:pPr>
+      <w:rPr>
+        <w:rFonts w:ascii="Courier New" w:hAnsi="Courier New" w:cs="Courier New" w:hint="default"/>
+      </w:rPr>
+    </w:lvl>
+    <w:lvl w:ilvl="8" w:tplc="04090005" w:tentative="1">
+      <w:start w:val="1"/>
+      <w:numFmt w:val="bullet"/>
+      <w:lvlText w:val=""/>
+      <w:lvlJc w:val="left"/>
+      <w:pPr>
+        <w:ind w:left="6120" w:hanging="360"/>
+      </w:pPr>
+      <w:rPr>
+        <w:rFonts w:ascii="Wingdings" w:hAnsi="Wingdings" w:hint="default"/>
+      </w:rPr>
+    </w:lvl>
+  </w:abstractNum>
+  <w:abstractNum w:abstractNumId="7" w15:restartNumberingAfterBreak="0">
     <w:nsid w:val="19C1373E"/>
     <w:multiLevelType w:val="hybridMultilevel"/>
     <w:tmpl w:val="0D6EA83A"/>
@@ -20102,7 +20172,7 @@
       </w:rPr>
     </w:lvl>
   </w:abstractNum>
-  <w:abstractNum w:abstractNumId="7" w15:restartNumberingAfterBreak="0">
+  <w:abstractNum w:abstractNumId="8" w15:restartNumberingAfterBreak="0">
     <w:nsid w:val="205E6B90"/>
     <w:multiLevelType w:val="hybridMultilevel"/>
     <w:tmpl w:val="6B528384"/>
@@ -20215,7 +20285,7 @@
       </w:rPr>
     </w:lvl>
   </w:abstractNum>
-  <w:abstractNum w:abstractNumId="8" w15:restartNumberingAfterBreak="0">
+  <w:abstractNum w:abstractNumId="9" w15:restartNumberingAfterBreak="0">
     <w:nsid w:val="23DF53DC"/>
     <w:multiLevelType w:val="hybridMultilevel"/>
     <w:tmpl w:val="B2AE6016"/>
@@ -20328,7 +20398,7 @@
       </w:rPr>
     </w:lvl>
   </w:abstractNum>
-  <w:abstractNum w:abstractNumId="9" w15:restartNumberingAfterBreak="0">
+  <w:abstractNum w:abstractNumId="10" w15:restartNumberingAfterBreak="0">
     <w:nsid w:val="2E7F052C"/>
     <w:multiLevelType w:val="hybridMultilevel"/>
     <w:tmpl w:val="509E2ED8"/>
@@ -20441,7 +20511,7 @@
       </w:rPr>
     </w:lvl>
   </w:abstractNum>
-  <w:abstractNum w:abstractNumId="10" w15:restartNumberingAfterBreak="0">
+  <w:abstractNum w:abstractNumId="11" w15:restartNumberingAfterBreak="0">
     <w:nsid w:val="2EC31D2E"/>
     <w:multiLevelType w:val="hybridMultilevel"/>
     <w:tmpl w:val="680C09DE"/>
@@ -20554,7 +20624,7 @@
       </w:rPr>
     </w:lvl>
   </w:abstractNum>
-  <w:abstractNum w:abstractNumId="11" w15:restartNumberingAfterBreak="0">
+  <w:abstractNum w:abstractNumId="12" w15:restartNumberingAfterBreak="0">
     <w:nsid w:val="37377500"/>
     <w:multiLevelType w:val="hybridMultilevel"/>
     <w:tmpl w:val="9FB44950"/>
@@ -20667,7 +20737,7 @@
       </w:rPr>
     </w:lvl>
   </w:abstractNum>
-  <w:abstractNum w:abstractNumId="12" w15:restartNumberingAfterBreak="0">
+  <w:abstractNum w:abstractNumId="13" w15:restartNumberingAfterBreak="0">
     <w:nsid w:val="398551AA"/>
     <w:multiLevelType w:val="hybridMultilevel"/>
     <w:tmpl w:val="76E22076"/>
@@ -20780,7 +20850,120 @@
       </w:rPr>
     </w:lvl>
   </w:abstractNum>
-  <w:abstractNum w:abstractNumId="13" w15:restartNumberingAfterBreak="0">
+  <w:abstractNum w:abstractNumId="14" w15:restartNumberingAfterBreak="0">
+    <w:nsid w:val="3CA71FA8"/>
+    <w:multiLevelType w:val="hybridMultilevel"/>
+    <w:tmpl w:val="44E42CE8"/>
+    <w:lvl w:ilvl="0" w:tplc="04090001">
+      <w:start w:val="1"/>
+      <w:numFmt w:val="bullet"/>
+      <w:lvlText w:val=""/>
+      <w:lvlJc w:val="left"/>
+      <w:pPr>
+        <w:ind w:left="360" w:hanging="360"/>
+      </w:pPr>
+      <w:rPr>
+        <w:rFonts w:ascii="Symbol" w:hAnsi="Symbol" w:hint="default"/>
+      </w:rPr>
+    </w:lvl>
+    <w:lvl w:ilvl="1" w:tplc="04090003" w:tentative="1">
+      <w:start w:val="1"/>
+      <w:numFmt w:val="bullet"/>
+      <w:lvlText w:val="o"/>
+      <w:lvlJc w:val="left"/>
+      <w:pPr>
+        <w:ind w:left="1080" w:hanging="360"/>
+      </w:pPr>
+      <w:rPr>
+        <w:rFonts w:ascii="Courier New" w:hAnsi="Courier New" w:cs="Courier New" w:hint="default"/>
+      </w:rPr>
+    </w:lvl>
+    <w:lvl w:ilvl="2" w:tplc="04090005" w:tentative="1">
+      <w:start w:val="1"/>
+      <w:numFmt w:val="bullet"/>
+      <w:lvlText w:val=""/>
+      <w:lvlJc w:val="left"/>
+      <w:pPr>
+        <w:ind w:left="1800" w:hanging="360"/>
+      </w:pPr>
+      <w:rPr>
+        <w:rFonts w:ascii="Wingdings" w:hAnsi="Wingdings" w:hint="default"/>
+      </w:rPr>
+    </w:lvl>
+    <w:lvl w:ilvl="3" w:tplc="04090001" w:tentative="1">
+      <w:start w:val="1"/>
+      <w:numFmt w:val="bullet"/>
+      <w:lvlText w:val=""/>
+      <w:lvlJc w:val="left"/>
+      <w:pPr>
+        <w:ind w:left="2520" w:hanging="360"/>
+      </w:pPr>
+      <w:rPr>
+        <w:rFonts w:ascii="Symbol" w:hAnsi="Symbol" w:hint="default"/>
+      </w:rPr>
+    </w:lvl>
+    <w:lvl w:ilvl="4" w:tplc="04090003" w:tentative="1">
+      <w:start w:val="1"/>
+      <w:numFmt w:val="bullet"/>
+      <w:lvlText w:val="o"/>
+      <w:lvlJc w:val="left"/>
+      <w:pPr>
+        <w:ind w:left="3240" w:hanging="360"/>
+      </w:pPr>
+      <w:rPr>
+        <w:rFonts w:ascii="Courier New" w:hAnsi="Courier New" w:cs="Courier New" w:hint="default"/>
+      </w:rPr>
+    </w:lvl>
+    <w:lvl w:ilvl="5" w:tplc="04090005" w:tentative="1">
+      <w:start w:val="1"/>
+      <w:numFmt w:val="bullet"/>
+      <w:lvlText w:val=""/>
+      <w:lvlJc w:val="left"/>
+      <w:pPr>
+        <w:ind w:left="3960" w:hanging="360"/>
+      </w:pPr>
+      <w:rPr>
+        <w:rFonts w:ascii="Wingdings" w:hAnsi="Wingdings" w:hint="default"/>
+      </w:rPr>
+    </w:lvl>
+    <w:lvl w:ilvl="6" w:tplc="04090001" w:tentative="1">
+      <w:start w:val="1"/>
+      <w:numFmt w:val="bullet"/>
+      <w:lvlText w:val=""/>
+      <w:lvlJc w:val="left"/>
+      <w:pPr>
+        <w:ind w:left="4680" w:hanging="360"/>
+      </w:pPr>
+      <w:rPr>
+        <w:rFonts w:ascii="Symbol" w:hAnsi="Symbol" w:hint="default"/>
+      </w:rPr>
+    </w:lvl>
+    <w:lvl w:ilvl="7" w:tplc="04090003" w:tentative="1">
+      <w:start w:val="1"/>
+      <w:numFmt w:val="bullet"/>
+      <w:lvlText w:val="o"/>
+      <w:lvlJc w:val="left"/>
+      <w:pPr>
+        <w:ind w:left="5400" w:hanging="360"/>
+      </w:pPr>
+      <w:rPr>
+        <w:rFonts w:ascii="Courier New" w:hAnsi="Courier New" w:cs="Courier New" w:hint="default"/>
+      </w:rPr>
+    </w:lvl>
+    <w:lvl w:ilvl="8" w:tplc="04090005" w:tentative="1">
+      <w:start w:val="1"/>
+      <w:numFmt w:val="bullet"/>
+      <w:lvlText w:val=""/>
+      <w:lvlJc w:val="left"/>
+      <w:pPr>
+        <w:ind w:left="6120" w:hanging="360"/>
+      </w:pPr>
+      <w:rPr>
+        <w:rFonts w:ascii="Wingdings" w:hAnsi="Wingdings" w:hint="default"/>
+      </w:rPr>
+    </w:lvl>
+  </w:abstractNum>
+  <w:abstractNum w:abstractNumId="15" w15:restartNumberingAfterBreak="0">
     <w:nsid w:val="3EF63398"/>
     <w:multiLevelType w:val="hybridMultilevel"/>
     <w:tmpl w:val="014620D0"/>
@@ -20893,7 +21076,7 @@
       </w:rPr>
     </w:lvl>
   </w:abstractNum>
-  <w:abstractNum w:abstractNumId="14" w15:restartNumberingAfterBreak="0">
+  <w:abstractNum w:abstractNumId="16" w15:restartNumberingAfterBreak="0">
     <w:nsid w:val="3F7E77E9"/>
     <w:multiLevelType w:val="hybridMultilevel"/>
     <w:tmpl w:val="E2821384"/>
@@ -21006,7 +21189,7 @@
       </w:rPr>
     </w:lvl>
   </w:abstractNum>
-  <w:abstractNum w:abstractNumId="15" w15:restartNumberingAfterBreak="0">
+  <w:abstractNum w:abstractNumId="17" w15:restartNumberingAfterBreak="0">
     <w:nsid w:val="41483909"/>
     <w:multiLevelType w:val="hybridMultilevel"/>
     <w:tmpl w:val="B79A2694"/>
@@ -21119,7 +21302,7 @@
       </w:rPr>
     </w:lvl>
   </w:abstractNum>
-  <w:abstractNum w:abstractNumId="16" w15:restartNumberingAfterBreak="0">
+  <w:abstractNum w:abstractNumId="18" w15:restartNumberingAfterBreak="0">
     <w:nsid w:val="433038A2"/>
     <w:multiLevelType w:val="hybridMultilevel"/>
     <w:tmpl w:val="997A7946"/>
@@ -21232,7 +21415,7 @@
       </w:rPr>
     </w:lvl>
   </w:abstractNum>
-  <w:abstractNum w:abstractNumId="17" w15:restartNumberingAfterBreak="0">
+  <w:abstractNum w:abstractNumId="19" w15:restartNumberingAfterBreak="0">
     <w:nsid w:val="49CD7AF0"/>
     <w:multiLevelType w:val="hybridMultilevel"/>
     <w:tmpl w:val="58181C3A"/>
@@ -21345,7 +21528,7 @@
       </w:rPr>
     </w:lvl>
   </w:abstractNum>
-  <w:abstractNum w:abstractNumId="18" w15:restartNumberingAfterBreak="0">
+  <w:abstractNum w:abstractNumId="20" w15:restartNumberingAfterBreak="0">
     <w:nsid w:val="4C150015"/>
     <w:multiLevelType w:val="multilevel"/>
     <w:tmpl w:val="44140D76"/>
@@ -21495,7 +21678,7 @@
       </w:rPr>
     </w:lvl>
   </w:abstractNum>
-  <w:abstractNum w:abstractNumId="19" w15:restartNumberingAfterBreak="0">
+  <w:abstractNum w:abstractNumId="21" w15:restartNumberingAfterBreak="0">
     <w:nsid w:val="554B53A6"/>
     <w:multiLevelType w:val="hybridMultilevel"/>
     <w:tmpl w:val="AB020B18"/>
@@ -21608,7 +21791,7 @@
       </w:rPr>
     </w:lvl>
   </w:abstractNum>
-  <w:abstractNum w:abstractNumId="20" w15:restartNumberingAfterBreak="0">
+  <w:abstractNum w:abstractNumId="22" w15:restartNumberingAfterBreak="0">
     <w:nsid w:val="64671B18"/>
     <w:multiLevelType w:val="hybridMultilevel"/>
     <w:tmpl w:val="54AEF472"/>
@@ -21721,7 +21904,120 @@
       </w:rPr>
     </w:lvl>
   </w:abstractNum>
-  <w:abstractNum w:abstractNumId="21" w15:restartNumberingAfterBreak="0">
+  <w:abstractNum w:abstractNumId="23" w15:restartNumberingAfterBreak="0">
+    <w:nsid w:val="665527F6"/>
+    <w:multiLevelType w:val="hybridMultilevel"/>
+    <w:tmpl w:val="8D209EFA"/>
+    <w:lvl w:ilvl="0" w:tplc="04090001">
+      <w:start w:val="1"/>
+      <w:numFmt w:val="bullet"/>
+      <w:lvlText w:val=""/>
+      <w:lvlJc w:val="left"/>
+      <w:pPr>
+        <w:ind w:left="360" w:hanging="360"/>
+      </w:pPr>
+      <w:rPr>
+        <w:rFonts w:ascii="Symbol" w:hAnsi="Symbol" w:hint="default"/>
+      </w:rPr>
+    </w:lvl>
+    <w:lvl w:ilvl="1" w:tplc="04090003" w:tentative="1">
+      <w:start w:val="1"/>
+      <w:numFmt w:val="bullet"/>
+      <w:lvlText w:val="o"/>
+      <w:lvlJc w:val="left"/>
+      <w:pPr>
+        <w:ind w:left="1080" w:hanging="360"/>
+      </w:pPr>
+      <w:rPr>
+        <w:rFonts w:ascii="Courier New" w:hAnsi="Courier New" w:cs="Courier New" w:hint="default"/>
+      </w:rPr>
+    </w:lvl>
+    <w:lvl w:ilvl="2" w:tplc="04090005" w:tentative="1">
+      <w:start w:val="1"/>
+      <w:numFmt w:val="bullet"/>
+      <w:lvlText w:val=""/>
+      <w:lvlJc w:val="left"/>
+      <w:pPr>
+        <w:ind w:left="1800" w:hanging="360"/>
+      </w:pPr>
+      <w:rPr>
+        <w:rFonts w:ascii="Wingdings" w:hAnsi="Wingdings" w:hint="default"/>
+      </w:rPr>
+    </w:lvl>
+    <w:lvl w:ilvl="3" w:tplc="04090001" w:tentative="1">
+      <w:start w:val="1"/>
+      <w:numFmt w:val="bullet"/>
+      <w:lvlText w:val=""/>
+      <w:lvlJc w:val="left"/>
+      <w:pPr>
+        <w:ind w:left="2520" w:hanging="360"/>
+      </w:pPr>
+      <w:rPr>
+        <w:rFonts w:ascii="Symbol" w:hAnsi="Symbol" w:hint="default"/>
+      </w:rPr>
+    </w:lvl>
+    <w:lvl w:ilvl="4" w:tplc="04090003" w:tentative="1">
+      <w:start w:val="1"/>
+      <w:numFmt w:val="bullet"/>
+      <w:lvlText w:val="o"/>
+      <w:lvlJc w:val="left"/>
+      <w:pPr>
+        <w:ind w:left="3240" w:hanging="360"/>
+      </w:pPr>
+      <w:rPr>
+        <w:rFonts w:ascii="Courier New" w:hAnsi="Courier New" w:cs="Courier New" w:hint="default"/>
+      </w:rPr>
+    </w:lvl>
+    <w:lvl w:ilvl="5" w:tplc="04090005" w:tentative="1">
+      <w:start w:val="1"/>
+      <w:numFmt w:val="bullet"/>
+      <w:lvlText w:val=""/>
+      <w:lvlJc w:val="left"/>
+      <w:pPr>
+        <w:ind w:left="3960" w:hanging="360"/>
+      </w:pPr>
+      <w:rPr>
+        <w:rFonts w:ascii="Wingdings" w:hAnsi="Wingdings" w:hint="default"/>
+      </w:rPr>
+    </w:lvl>
+    <w:lvl w:ilvl="6" w:tplc="04090001" w:tentative="1">
+      <w:start w:val="1"/>
+      <w:numFmt w:val="bullet"/>
+      <w:lvlText w:val=""/>
+      <w:lvlJc w:val="left"/>
+      <w:pPr>
+        <w:ind w:left="4680" w:hanging="360"/>
+      </w:pPr>
+      <w:rPr>
+        <w:rFonts w:ascii="Symbol" w:hAnsi="Symbol" w:hint="default"/>
+      </w:rPr>
+    </w:lvl>
+    <w:lvl w:ilvl="7" w:tplc="04090003" w:tentative="1">
+      <w:start w:val="1"/>
+      <w:numFmt w:val="bullet"/>
+      <w:lvlText w:val="o"/>
+      <w:lvlJc w:val="left"/>
+      <w:pPr>
+        <w:ind w:left="5400" w:hanging="360"/>
+      </w:pPr>
+      <w:rPr>
+        <w:rFonts w:ascii="Courier New" w:hAnsi="Courier New" w:cs="Courier New" w:hint="default"/>
+      </w:rPr>
+    </w:lvl>
+    <w:lvl w:ilvl="8" w:tplc="04090005" w:tentative="1">
+      <w:start w:val="1"/>
+      <w:numFmt w:val="bullet"/>
+      <w:lvlText w:val=""/>
+      <w:lvlJc w:val="left"/>
+      <w:pPr>
+        <w:ind w:left="6120" w:hanging="360"/>
+      </w:pPr>
+      <w:rPr>
+        <w:rFonts w:ascii="Wingdings" w:hAnsi="Wingdings" w:hint="default"/>
+      </w:rPr>
+    </w:lvl>
+  </w:abstractNum>
+  <w:abstractNum w:abstractNumId="24" w15:restartNumberingAfterBreak="0">
     <w:nsid w:val="713967E4"/>
     <w:multiLevelType w:val="hybridMultilevel"/>
     <w:tmpl w:val="A906C60A"/>
@@ -21834,7 +22130,7 @@
       </w:rPr>
     </w:lvl>
   </w:abstractNum>
-  <w:abstractNum w:abstractNumId="22" w15:restartNumberingAfterBreak="0">
+  <w:abstractNum w:abstractNumId="25" w15:restartNumberingAfterBreak="0">
     <w:nsid w:val="73962582"/>
     <w:multiLevelType w:val="hybridMultilevel"/>
     <w:tmpl w:val="46EC3E88"/>
@@ -21947,7 +22243,7 @@
       </w:rPr>
     </w:lvl>
   </w:abstractNum>
-  <w:abstractNum w:abstractNumId="23" w15:restartNumberingAfterBreak="0">
+  <w:abstractNum w:abstractNumId="26" w15:restartNumberingAfterBreak="0">
     <w:nsid w:val="78EF35F1"/>
     <w:multiLevelType w:val="hybridMultilevel"/>
     <w:tmpl w:val="4D344736"/>
@@ -22060,7 +22356,7 @@
       </w:rPr>
     </w:lvl>
   </w:abstractNum>
-  <w:abstractNum w:abstractNumId="24" w15:restartNumberingAfterBreak="0">
+  <w:abstractNum w:abstractNumId="27" w15:restartNumberingAfterBreak="0">
     <w:nsid w:val="79A756C2"/>
     <w:multiLevelType w:val="multilevel"/>
     <w:tmpl w:val="44140D76"/>
@@ -22210,7 +22506,7 @@
       </w:rPr>
     </w:lvl>
   </w:abstractNum>
-  <w:abstractNum w:abstractNumId="25" w15:restartNumberingAfterBreak="0">
+  <w:abstractNum w:abstractNumId="28" w15:restartNumberingAfterBreak="0">
     <w:nsid w:val="7BBF164A"/>
     <w:multiLevelType w:val="hybridMultilevel"/>
     <w:tmpl w:val="9AEE34D4"/>
@@ -22324,58 +22620,58 @@
     </w:lvl>
   </w:abstractNum>
   <w:num w:numId="1" w16cid:durableId="340085222">
-    <w:abstractNumId w:val="14"/>
+    <w:abstractNumId w:val="16"/>
   </w:num>
   <w:num w:numId="2" w16cid:durableId="408966763">
     <w:abstractNumId w:val="4"/>
   </w:num>
   <w:num w:numId="3" w16cid:durableId="1411931199">
-    <w:abstractNumId w:val="8"/>
+    <w:abstractNumId w:val="9"/>
   </w:num>
   <w:num w:numId="4" w16cid:durableId="1095203796">
-    <w:abstractNumId w:val="12"/>
+    <w:abstractNumId w:val="13"/>
   </w:num>
   <w:num w:numId="5" w16cid:durableId="1047265359">
     <w:abstractNumId w:val="5"/>
   </w:num>
   <w:num w:numId="6" w16cid:durableId="1114905849">
-    <w:abstractNumId w:val="11"/>
+    <w:abstractNumId w:val="12"/>
   </w:num>
   <w:num w:numId="7" w16cid:durableId="225648242">
-    <w:abstractNumId w:val="16"/>
+    <w:abstractNumId w:val="18"/>
   </w:num>
   <w:num w:numId="8" w16cid:durableId="413478517">
-    <w:abstractNumId w:val="22"/>
+    <w:abstractNumId w:val="25"/>
   </w:num>
   <w:num w:numId="9" w16cid:durableId="1348755509">
     <w:abstractNumId w:val="3"/>
   </w:num>
   <w:num w:numId="10" w16cid:durableId="221599985">
-    <w:abstractNumId w:val="18"/>
+    <w:abstractNumId w:val="20"/>
   </w:num>
   <w:num w:numId="11" w16cid:durableId="1596136308">
-    <w:abstractNumId w:val="24"/>
+    <w:abstractNumId w:val="27"/>
   </w:num>
   <w:num w:numId="12" w16cid:durableId="1515723426">
     <w:abstractNumId w:val="0"/>
   </w:num>
   <w:num w:numId="13" w16cid:durableId="1100680396">
-    <w:abstractNumId w:val="9"/>
+    <w:abstractNumId w:val="10"/>
   </w:num>
   <w:num w:numId="14" w16cid:durableId="1755206141">
-    <w:abstractNumId w:val="10"/>
+    <w:abstractNumId w:val="11"/>
   </w:num>
   <w:num w:numId="15" w16cid:durableId="646857460">
-    <w:abstractNumId w:val="15"/>
+    <w:abstractNumId w:val="17"/>
   </w:num>
   <w:num w:numId="16" w16cid:durableId="1808350774">
-    <w:abstractNumId w:val="19"/>
+    <w:abstractNumId w:val="21"/>
   </w:num>
   <w:num w:numId="17" w16cid:durableId="896671277">
-    <w:abstractNumId w:val="20"/>
+    <w:abstractNumId w:val="22"/>
   </w:num>
   <w:num w:numId="18" w16cid:durableId="1956982614">
-    <w:abstractNumId w:val="13"/>
+    <w:abstractNumId w:val="15"/>
   </w:num>
   <w:num w:numId="19" w16cid:durableId="863785178">
     <w:abstractNumId w:val="2"/>
@@ -22384,22 +22680,31 @@
     <w:abstractNumId w:val="1"/>
   </w:num>
   <w:num w:numId="21" w16cid:durableId="1479834044">
+    <w:abstractNumId w:val="26"/>
+  </w:num>
+  <w:num w:numId="22" w16cid:durableId="1984192171">
+    <w:abstractNumId w:val="8"/>
+  </w:num>
+  <w:num w:numId="23" w16cid:durableId="472868916">
+    <w:abstractNumId w:val="24"/>
+  </w:num>
+  <w:num w:numId="24" w16cid:durableId="44373150">
+    <w:abstractNumId w:val="7"/>
+  </w:num>
+  <w:num w:numId="25" w16cid:durableId="2028172540">
+    <w:abstractNumId w:val="19"/>
+  </w:num>
+  <w:num w:numId="26" w16cid:durableId="1092507730">
+    <w:abstractNumId w:val="28"/>
+  </w:num>
+  <w:num w:numId="27" w16cid:durableId="1495487015">
     <w:abstractNumId w:val="23"/>
   </w:num>
-  <w:num w:numId="22" w16cid:durableId="1984192171">
-    <w:abstractNumId w:val="7"/>
+  <w:num w:numId="28" w16cid:durableId="403646334">
+    <w:abstractNumId w:val="14"/>
   </w:num>
-  <w:num w:numId="23" w16cid:durableId="472868916">
-    <w:abstractNumId w:val="21"/>
-  </w:num>
-  <w:num w:numId="24" w16cid:durableId="44373150">
+  <w:num w:numId="29" w16cid:durableId="1662153465">
     <w:abstractNumId w:val="6"/>
-  </w:num>
-  <w:num w:numId="25" w16cid:durableId="2028172540">
-    <w:abstractNumId w:val="17"/>
-  </w:num>
-  <w:num w:numId="26" w16cid:durableId="1092507730">
-    <w:abstractNumId w:val="25"/>
   </w:num>
 </w:numbering>
 </file>
@@ -23007,6 +23312,7 @@
   <w:style w:type="character" w:default="1" w:styleId="DefaultParagraphFont">
     <w:name w:val="Default Paragraph Font"/>
     <w:uiPriority w:val="1"/>
+    <w:semiHidden/>
     <w:unhideWhenUsed/>
   </w:style>
   <w:style w:type="table" w:default="1" w:styleId="TableNormal">

</xml_diff>